<commit_message>
Update 11 Opening Procedures.docx
Removed a word, "back"
</commit_message>
<xml_diff>
--- a/11 Opening Procedures.docx
+++ b/11 Opening Procedures.docx
@@ -76,19 +76,8 @@
           <w:sz w:val="26"/>
           <w:szCs w:val="26"/>
         </w:rPr>
-        <w:t xml:space="preserve"> </w:t>
-      </w:r>
-      <w:proofErr w:type="gramStart"/>
-      <w:r>
-        <w:rPr>
-          <w:i/>
-          <w:iCs/>
-          <w:sz w:val="26"/>
-          <w:szCs w:val="26"/>
-        </w:rPr>
-        <w:t>first priority</w:t>
-      </w:r>
-      <w:proofErr w:type="gramEnd"/>
+        <w:t xml:space="preserve"> first priority</w:t>
+      </w:r>
       <w:r>
         <w:rPr>
           <w:i/>
@@ -553,13 +542,8 @@
       <w:r>
         <w:t xml:space="preserve">sure that the </w:t>
       </w:r>
-      <w:proofErr w:type="gramStart"/>
-      <w:r>
-        <w:t>time sheet</w:t>
-      </w:r>
-      <w:proofErr w:type="gramEnd"/>
-      <w:r>
-        <w:t xml:space="preserve"> </w:t>
+      <w:r>
+        <w:t xml:space="preserve">time sheet </w:t>
       </w:r>
       <w:r>
         <w:t xml:space="preserve">is </w:t>
@@ -994,13 +978,8 @@
       <w:r>
         <w:t xml:space="preserve">Prepare patron carts by loading all but one or two with </w:t>
       </w:r>
-      <w:proofErr w:type="gramStart"/>
-      <w:r>
-        <w:t>opened</w:t>
-      </w:r>
-      <w:proofErr w:type="gramEnd"/>
-      <w:r>
-        <w:t xml:space="preserve"> paper</w:t>
+      <w:r>
+        <w:t>opened paper</w:t>
       </w:r>
       <w:r>
         <w:t xml:space="preserve"> grocery bags</w:t>
@@ -1243,13 +1222,8 @@
       <w:r>
         <w:t xml:space="preserve">, </w:t>
       </w:r>
-      <w:proofErr w:type="gramStart"/>
-      <w:r>
-        <w:t>breads</w:t>
-      </w:r>
-      <w:proofErr w:type="gramEnd"/>
-      <w:r>
-        <w:t>, tortillas, and yeast</w:t>
+      <w:r>
+        <w:t>breads, tortillas, and yeast</w:t>
       </w:r>
     </w:p>
     <w:p>
@@ -1297,7 +1271,7 @@
         <w:rPr>
           <w:u w:val="single"/>
         </w:rPr>
-        <w:t>Preparation for opening in the back warehouse</w:t>
+        <w:t>Preparation for opening in the warehouse</w:t>
       </w:r>
       <w:r>
         <w:rPr>
@@ -1523,13 +1497,8 @@
         <w:t>Prior</w:t>
       </w:r>
       <w:r>
-        <w:t xml:space="preserve"> to the </w:t>
-      </w:r>
-      <w:proofErr w:type="gramStart"/>
-      <w:r>
-        <w:t>meeting</w:t>
-      </w:r>
-      <w:proofErr w:type="gramEnd"/>
+        <w:t xml:space="preserve"> to the meeting</w:t>
+      </w:r>
       <w:r>
         <w:t xml:space="preserve"> i</w:t>
       </w:r>

</xml_diff>